<commit_message>
Build System scripts and docu
</commit_message>
<xml_diff>
--- a/anleitungen/pi-ager-basic-install_rev5.docx
+++ b/anleitungen/pi-ager-basic-install_rev5.docx
@@ -86,27 +86,13 @@
         <w:rPr>
           <w:lang w:val="en-US"/>
         </w:rPr>
-        <w:t xml:space="preserve"> (2</w:t>
-      </w:r>
-      <w:proofErr w:type="gramStart"/>
-      <w:r>
-        <w:rPr>
-          <w:lang w:val="en-US"/>
-        </w:rPr>
-        <w:t>)</w:t>
-      </w:r>
-      <w:r>
-        <w:rPr>
-          <w:lang w:val="en-US"/>
-        </w:rPr>
-        <w:t>w</w:t>
-      </w:r>
-      <w:proofErr w:type="gramEnd"/>
-      <w:r>
-        <w:rPr>
-          <w:lang w:val="en-US"/>
-        </w:rPr>
-        <w:t xml:space="preserve"> </w:t>
+        <w:t xml:space="preserve"> (2)</w:t>
+      </w:r>
+      <w:r>
+        <w:rPr>
+          <w:lang w:val="en-US"/>
+        </w:rPr>
+        <w:t xml:space="preserve">w </w:t>
       </w:r>
       <w:r>
         <w:rPr>
@@ -208,8 +194,37 @@
         <w:rPr>
           <w:lang w:val="en-US"/>
         </w:rPr>
-        <w:t xml:space="preserve"> Raspberry Pi Imager v1.8.4 or later.</w:t>
-      </w:r>
+        <w:t xml:space="preserve"> Raspberry Pi Imager v1.8.4 or later</w:t>
+      </w:r>
+      <w:r>
+        <w:rPr>
+          <w:lang w:val="en-US"/>
+        </w:rPr>
+        <w:t xml:space="preserve"> from </w:t>
+      </w:r>
+      <w:hyperlink r:id="rId5" w:history="1">
+        <w:r>
+          <w:rPr>
+            <w:rStyle w:val="Hyperlink"/>
+            <w:lang w:val="en-US"/>
+          </w:rPr>
+          <w:t>https://www.raspberrypi.com/software/</w:t>
+        </w:r>
+      </w:hyperlink>
+      <w:r>
+        <w:rPr>
+          <w:lang w:val="en-US"/>
+        </w:rPr>
+        <w:t>.</w:t>
+      </w:r>
+    </w:p>
+    <w:p>
+      <w:pPr>
+        <w:pStyle w:val="Listenabsatz"/>
+        <w:rPr>
+          <w:lang w:val="en-US"/>
+        </w:rPr>
+      </w:pPr>
     </w:p>
     <w:p>
       <w:pPr>
@@ -228,7 +243,25 @@
         <w:rPr>
           <w:lang w:val="en-US"/>
         </w:rPr>
-        <w:t>continue as follows</w:t>
+        <w:t xml:space="preserve">continue </w:t>
+      </w:r>
+      <w:r>
+        <w:rPr>
+          <w:lang w:val="en-US"/>
+        </w:rPr>
+        <w:t>with the</w:t>
+      </w:r>
+      <w:r>
+        <w:rPr>
+          <w:lang w:val="en-US"/>
+        </w:rPr>
+        <w:t xml:space="preserve"> follow</w:t>
+      </w:r>
+      <w:r>
+        <w:rPr>
+          <w:lang w:val="en-US"/>
+        </w:rPr>
+        <w:t xml:space="preserve"> steps</w:t>
       </w:r>
       <w:r>
         <w:rPr>
@@ -285,7 +318,7 @@
             <o:lock v:ext="edit" aspectratio="t"/>
           </v:shapetype>
           <v:shape id="_x0000_i1025" type="#_x0000_t75" style="width:453pt;height:320.25pt">
-            <v:imagedata r:id="rId5" o:title="sys-config1"/>
+            <v:imagedata r:id="rId6" o:title="sys-config1"/>
           </v:shape>
         </w:pict>
       </w:r>
@@ -312,7 +345,7 @@
         <w:lastRenderedPageBreak/>
         <w:pict>
           <v:shape id="_x0000_i1026" type="#_x0000_t75" style="width:453pt;height:320.25pt">
-            <v:imagedata r:id="rId6" o:title="sys-config2"/>
+            <v:imagedata r:id="rId7" o:title="sys-config2"/>
           </v:shape>
         </w:pict>
       </w:r>
@@ -346,7 +379,7 @@
         </w:rPr>
         <w:pict>
           <v:shape id="_x0000_i1027" type="#_x0000_t75" style="width:453pt;height:320.25pt">
-            <v:imagedata r:id="rId7" o:title="sys-config3"/>
+            <v:imagedata r:id="rId8" o:title="sys-config3"/>
           </v:shape>
         </w:pict>
       </w:r>
@@ -381,7 +414,7 @@
         <w:lastRenderedPageBreak/>
         <w:pict>
           <v:shape id="_x0000_i1028" type="#_x0000_t75" style="width:453pt;height:320.25pt">
-            <v:imagedata r:id="rId8" o:title="sys-config4"/>
+            <v:imagedata r:id="rId9" o:title="sys-config4"/>
           </v:shape>
         </w:pict>
       </w:r>
@@ -407,7 +440,7 @@
         </w:rPr>
         <w:pict>
           <v:shape id="_x0000_i1029" type="#_x0000_t75" style="width:453pt;height:320.25pt">
-            <v:imagedata r:id="rId9" o:title="sys-config5"/>
+            <v:imagedata r:id="rId10" o:title="sys-config5"/>
           </v:shape>
         </w:pict>
       </w:r>
@@ -442,7 +475,7 @@
         <w:lastRenderedPageBreak/>
         <w:pict>
           <v:shape id="_x0000_i1030" type="#_x0000_t75" style="width:453pt;height:320.25pt">
-            <v:imagedata r:id="rId10" o:title="sys-config6"/>
+            <v:imagedata r:id="rId11" o:title="sys-config6"/>
           </v:shape>
         </w:pict>
       </w:r>
@@ -484,7 +517,7 @@
         </w:rPr>
         <w:pict>
           <v:shape id="_x0000_i1031" type="#_x0000_t75" style="width:453pt;height:320.25pt">
-            <v:imagedata r:id="rId11" o:title="sys-config7"/>
+            <v:imagedata r:id="rId12" o:title="sys-config7"/>
           </v:shape>
         </w:pict>
       </w:r>
@@ -526,7 +559,7 @@
         </w:rPr>
         <w:pict>
           <v:shape id="_x0000_i1032" type="#_x0000_t75" style="width:405.75pt;height:496.5pt">
-            <v:imagedata r:id="rId12" o:title="sys-config8"/>
+            <v:imagedata r:id="rId13" o:title="sys-config8"/>
           </v:shape>
         </w:pict>
       </w:r>
@@ -569,7 +602,7 @@
         <w:lastRenderedPageBreak/>
         <w:pict>
           <v:shape id="_x0000_i1033" type="#_x0000_t75" style="width:405.75pt;height:496.5pt">
-            <v:imagedata r:id="rId13" o:title="sys-config9"/>
+            <v:imagedata r:id="rId14" o:title="sys-config9"/>
           </v:shape>
         </w:pict>
       </w:r>
@@ -620,7 +653,7 @@
         <w:lastRenderedPageBreak/>
         <w:pict>
           <v:shape id="_x0000_i1034" type="#_x0000_t75" style="width:453pt;height:320.25pt">
-            <v:imagedata r:id="rId14" o:title="sys-config10"/>
+            <v:imagedata r:id="rId15" o:title="sys-config10"/>
           </v:shape>
         </w:pict>
       </w:r>
@@ -654,7 +687,7 @@
         </w:rPr>
         <w:pict>
           <v:shape id="_x0000_i1035" type="#_x0000_t75" style="width:453pt;height:320.25pt">
-            <v:imagedata r:id="rId15" o:title="sys-config11"/>
+            <v:imagedata r:id="rId16" o:title="sys-config11"/>
           </v:shape>
         </w:pict>
       </w:r>
@@ -733,43 +766,21 @@
         <w:rPr>
           <w:lang w:val="en-US"/>
         </w:rPr>
-        <w:t xml:space="preserve">Login via SSH (e.g. use </w:t>
-      </w:r>
-      <w:proofErr w:type="spellStart"/>
-      <w:r>
-        <w:rPr>
-          <w:lang w:val="en-US"/>
-        </w:rPr>
-        <w:t>PuTTY</w:t>
-      </w:r>
-      <w:proofErr w:type="spellEnd"/>
-      <w:r>
-        <w:rPr>
-          <w:lang w:val="en-US"/>
-        </w:rPr>
-        <w:t xml:space="preserve">) or connect a HDMI monitor and USB keyboard to </w:t>
-      </w:r>
-    </w:p>
-    <w:p>
-      <w:pPr>
-        <w:pStyle w:val="Listenabsatz"/>
-        <w:rPr>
-          <w:lang w:val="en-US"/>
-        </w:rPr>
-      </w:pPr>
-      <w:proofErr w:type="gramStart"/>
-      <w:r>
-        <w:rPr>
-          <w:lang w:val="en-US"/>
-        </w:rPr>
-        <w:t>your</w:t>
-      </w:r>
-      <w:proofErr w:type="gramEnd"/>
-      <w:r>
-        <w:rPr>
-          <w:lang w:val="en-US"/>
-        </w:rPr>
-        <w:t xml:space="preserve"> Raspberry device and continue with the setup as described below.</w:t>
+        <w:t xml:space="preserve">Login via SSH (e.g. use PuTTY) or connect a HDMI monitor and USB keyboard to </w:t>
+      </w:r>
+    </w:p>
+    <w:p>
+      <w:pPr>
+        <w:pStyle w:val="Listenabsatz"/>
+        <w:rPr>
+          <w:lang w:val="en-US"/>
+        </w:rPr>
+      </w:pPr>
+      <w:r>
+        <w:rPr>
+          <w:lang w:val="en-US"/>
+        </w:rPr>
+        <w:t>your Raspberry device and continue with the setup as described below.</w:t>
       </w:r>
     </w:p>
     <w:p>
@@ -795,157 +806,7 @@
         <w:rPr>
           <w:lang w:val="en-US"/>
         </w:rPr>
-        <w:t xml:space="preserve">Download </w:t>
-      </w:r>
-      <w:r>
-        <w:rPr>
-          <w:lang w:val="en-US"/>
-        </w:rPr>
-        <w:t xml:space="preserve">system build </w:t>
-      </w:r>
-      <w:r>
-        <w:rPr>
-          <w:lang w:val="en-US"/>
-        </w:rPr>
-        <w:t xml:space="preserve">scripts from </w:t>
-      </w:r>
-      <w:proofErr w:type="spellStart"/>
-      <w:r>
-        <w:rPr>
-          <w:lang w:val="en-US"/>
-        </w:rPr>
-        <w:t>github</w:t>
-      </w:r>
-      <w:proofErr w:type="spellEnd"/>
-      <w:r>
-        <w:rPr>
-          <w:lang w:val="en-US"/>
-        </w:rPr>
-        <w:t>:</w:t>
-      </w:r>
-    </w:p>
-    <w:p>
-      <w:pPr>
-        <w:pStyle w:val="Listenabsatz"/>
-        <w:rPr>
-          <w:lang w:val="en-US"/>
-        </w:rPr>
-      </w:pPr>
-      <w:proofErr w:type="gramStart"/>
-      <w:r>
-        <w:rPr>
-          <w:color w:val="FF0000"/>
-          <w:lang w:val="en-US"/>
-        </w:rPr>
-        <w:t>cd</w:t>
-      </w:r>
-      <w:proofErr w:type="gramEnd"/>
-      <w:r>
-        <w:rPr>
-          <w:color w:val="FF0000"/>
-          <w:lang w:val="en-US"/>
-        </w:rPr>
-        <w:t xml:space="preserve"> ~</w:t>
-      </w:r>
-    </w:p>
-    <w:p>
-      <w:pPr>
-        <w:pStyle w:val="Listenabsatz"/>
-        <w:rPr>
-          <w:lang w:val="en-US"/>
-        </w:rPr>
-      </w:pPr>
-      <w:proofErr w:type="spellStart"/>
-      <w:proofErr w:type="gramStart"/>
-      <w:r>
-        <w:rPr>
-          <w:color w:val="FF0000"/>
-          <w:lang w:val="en-US"/>
-        </w:rPr>
-        <w:t>wget</w:t>
-      </w:r>
-      <w:proofErr w:type="spellEnd"/>
-      <w:proofErr w:type="gramEnd"/>
-      <w:r>
-        <w:rPr>
-          <w:color w:val="FF0000"/>
-          <w:lang w:val="en-US"/>
-        </w:rPr>
-        <w:t xml:space="preserve"> -O pi-ager-build-system.sh -</w:t>
-      </w:r>
-      <w:proofErr w:type="spellStart"/>
-      <w:r>
-        <w:rPr>
-          <w:color w:val="FF0000"/>
-          <w:lang w:val="en-US"/>
-        </w:rPr>
-        <w:t>nv</w:t>
-      </w:r>
-      <w:proofErr w:type="spellEnd"/>
-      <w:r>
-        <w:rPr>
-          <w:lang w:val="en-US"/>
-        </w:rPr>
-        <w:t xml:space="preserve"> </w:t>
-      </w:r>
-      <w:hyperlink r:id="rId16" w:history="1">
-        <w:r>
-          <w:rPr>
-            <w:rStyle w:val="Hyperlink"/>
-            <w:lang w:val="en-US"/>
-          </w:rPr>
-          <w:t>https://raw.githubusercontent.com/Tronje-the-Falconer/Pi-Ager/resources/ anleitungen/pi-ager-build-system.sh</w:t>
-        </w:r>
-      </w:hyperlink>
-    </w:p>
-    <w:p>
-      <w:pPr>
-        <w:pStyle w:val="Listenabsatz"/>
-        <w:rPr>
-          <w:lang w:val="en-US"/>
-        </w:rPr>
-      </w:pPr>
-    </w:p>
-    <w:p>
-      <w:pPr>
-        <w:pStyle w:val="Listenabsatz"/>
-        <w:rPr>
-          <w:lang w:val="en-US"/>
-        </w:rPr>
-      </w:pPr>
-      <w:proofErr w:type="spellStart"/>
-      <w:proofErr w:type="gramStart"/>
-      <w:r>
-        <w:rPr>
-          <w:color w:val="FF0000"/>
-          <w:lang w:val="en-US"/>
-        </w:rPr>
-        <w:t>wget</w:t>
-      </w:r>
-      <w:proofErr w:type="spellEnd"/>
-      <w:proofErr w:type="gramEnd"/>
-      <w:r>
-        <w:rPr>
-          <w:color w:val="FF0000"/>
-          <w:lang w:val="en-US"/>
-        </w:rPr>
-        <w:t xml:space="preserve"> -O pi-ager-finalize-build.sh -</w:t>
-      </w:r>
-      <w:proofErr w:type="spellStart"/>
-      <w:r>
-        <w:rPr>
-          <w:color w:val="FF0000"/>
-          <w:lang w:val="en-US"/>
-        </w:rPr>
-        <w:t>nv</w:t>
-      </w:r>
-      <w:proofErr w:type="spellEnd"/>
-      <w:r>
-        <w:rPr>
-          <w:color w:val="FF0000"/>
-          <w:lang w:val="en-US"/>
-        </w:rPr>
-        <w:t xml:space="preserve"> </w:t>
+        <w:t xml:space="preserve">Download and install PuTTY from </w:t>
       </w:r>
       <w:hyperlink r:id="rId17" w:history="1">
         <w:r>
@@ -953,7 +814,7 @@
             <w:rStyle w:val="Hyperlink"/>
             <w:lang w:val="en-US"/>
           </w:rPr>
-          <w:t>https://raw.githubusercontent.com/Tronje-the-Falconer/Pi-Ager/resources/anleitungen/pi-ager-finalize-build.sh</w:t>
+          <w:t>https://www.putty.org/</w:t>
         </w:r>
       </w:hyperlink>
     </w:p>
@@ -964,225 +825,6 @@
           <w:lang w:val="en-US"/>
         </w:rPr>
       </w:pPr>
-    </w:p>
-    <w:p>
-      <w:pPr>
-        <w:pStyle w:val="Listenabsatz"/>
-        <w:rPr>
-          <w:color w:val="FF0000"/>
-          <w:lang w:val="en-US"/>
-        </w:rPr>
-      </w:pPr>
-      <w:proofErr w:type="spellStart"/>
-      <w:proofErr w:type="gramStart"/>
-      <w:r>
-        <w:rPr>
-          <w:color w:val="FF0000"/>
-          <w:lang w:val="en-US"/>
-        </w:rPr>
-        <w:t>chmod</w:t>
-      </w:r>
-      <w:proofErr w:type="spellEnd"/>
-      <w:proofErr w:type="gramEnd"/>
-      <w:r>
-        <w:rPr>
-          <w:color w:val="FF0000"/>
-          <w:lang w:val="en-US"/>
-        </w:rPr>
-        <w:t xml:space="preserve"> +x *.</w:t>
-      </w:r>
-      <w:proofErr w:type="spellStart"/>
-      <w:r>
-        <w:rPr>
-          <w:color w:val="FF0000"/>
-          <w:lang w:val="en-US"/>
-        </w:rPr>
-        <w:t>sh</w:t>
-      </w:r>
-      <w:proofErr w:type="spellEnd"/>
-    </w:p>
-    <w:p>
-      <w:pPr>
-        <w:pStyle w:val="Listenabsatz"/>
-        <w:rPr>
-          <w:lang w:val="en-US"/>
-        </w:rPr>
-      </w:pPr>
-    </w:p>
-    <w:p>
-      <w:pPr>
-        <w:pStyle w:val="Listenabsatz"/>
-        <w:rPr>
-          <w:lang w:val="en-US"/>
-        </w:rPr>
-      </w:pPr>
-      <w:r>
-        <w:rPr>
-          <w:lang w:val="en-US"/>
-        </w:rPr>
-        <w:t>Start now first phase of Pi-Ager System setup:</w:t>
-      </w:r>
-    </w:p>
-    <w:p>
-      <w:pPr>
-        <w:pStyle w:val="Listenabsatz"/>
-        <w:rPr>
-          <w:color w:val="FF0000"/>
-          <w:lang w:val="en-US"/>
-        </w:rPr>
-      </w:pPr>
-      <w:proofErr w:type="spellStart"/>
-      <w:proofErr w:type="gramStart"/>
-      <w:r>
-        <w:rPr>
-          <w:color w:val="FF0000"/>
-          <w:lang w:val="en-US"/>
-        </w:rPr>
-        <w:t>sudo</w:t>
-      </w:r>
-      <w:proofErr w:type="spellEnd"/>
-      <w:proofErr w:type="gramEnd"/>
-      <w:r>
-        <w:rPr>
-          <w:color w:val="FF0000"/>
-          <w:lang w:val="en-US"/>
-        </w:rPr>
-        <w:t xml:space="preserve"> ./pi-ager-build-system.sh</w:t>
-      </w:r>
-    </w:p>
-    <w:p>
-      <w:pPr>
-        <w:pStyle w:val="Listenabsatz"/>
-        <w:rPr>
-          <w:color w:val="FF0000"/>
-          <w:lang w:val="en-US"/>
-        </w:rPr>
-      </w:pPr>
-    </w:p>
-    <w:p>
-      <w:pPr>
-        <w:pStyle w:val="Listenabsatz"/>
-        <w:rPr>
-          <w:lang w:val="en-US"/>
-        </w:rPr>
-      </w:pPr>
-      <w:r>
-        <w:rPr>
-          <w:lang w:val="en-US"/>
-        </w:rPr>
-        <w:t xml:space="preserve">You can now follow the system </w:t>
-      </w:r>
-      <w:proofErr w:type="gramStart"/>
-      <w:r>
-        <w:rPr>
-          <w:lang w:val="en-US"/>
-        </w:rPr>
-        <w:t>setup, that</w:t>
-      </w:r>
-      <w:proofErr w:type="gramEnd"/>
-      <w:r>
-        <w:rPr>
-          <w:lang w:val="en-US"/>
-        </w:rPr>
-        <w:t xml:space="preserve"> is divided in 4 steps with rebooting between </w:t>
-      </w:r>
-      <w:r>
-        <w:rPr>
-          <w:lang w:val="en-US"/>
-        </w:rPr>
-        <w:t>the steps. After step 3 you should edit the file /boot/firmware/setup.txt that contains information about passwords, WLAN setup parameter, temperature/humidity sensor to use and optional HMI display connected to your Pi-Ager.</w:t>
-      </w:r>
-    </w:p>
-    <w:p>
-      <w:pPr>
-        <w:pStyle w:val="Listenabsatz"/>
-        <w:rPr>
-          <w:lang w:val="en-US"/>
-        </w:rPr>
-      </w:pPr>
-      <w:r>
-        <w:rPr>
-          <w:lang w:val="en-US"/>
-        </w:rPr>
-        <w:t>After saving setup.txt the last step initializes the Pi-Ager system with data from setup.txt by starting the script pi-ager-finalize-build.sh:</w:t>
-      </w:r>
-    </w:p>
-    <w:p>
-      <w:pPr>
-        <w:pStyle w:val="Listenabsatz"/>
-        <w:rPr>
-          <w:lang w:val="en-US"/>
-        </w:rPr>
-      </w:pPr>
-    </w:p>
-    <w:p>
-      <w:pPr>
-        <w:pStyle w:val="Listenabsatz"/>
-        <w:rPr>
-          <w:color w:val="FF0000"/>
-          <w:lang w:val="en-US"/>
-        </w:rPr>
-      </w:pPr>
-      <w:proofErr w:type="spellStart"/>
-      <w:proofErr w:type="gramStart"/>
-      <w:r>
-        <w:rPr>
-          <w:color w:val="FF0000"/>
-          <w:lang w:val="en-US"/>
-        </w:rPr>
-        <w:t>sudo</w:t>
-      </w:r>
-      <w:proofErr w:type="spellEnd"/>
-      <w:proofErr w:type="gramEnd"/>
-      <w:r>
-        <w:rPr>
-          <w:color w:val="FF0000"/>
-          <w:lang w:val="en-US"/>
-        </w:rPr>
-        <w:t xml:space="preserve"> ./pi-ager-finalize-build.sh</w:t>
-      </w:r>
-    </w:p>
-    <w:p>
-      <w:pPr>
-        <w:pStyle w:val="Listenabsatz"/>
-        <w:rPr>
-          <w:lang w:val="en-US"/>
-        </w:rPr>
-      </w:pPr>
-    </w:p>
-    <w:p>
-      <w:pPr>
-        <w:pStyle w:val="Listenabsatz"/>
-        <w:rPr>
-          <w:lang w:val="en-US"/>
-        </w:rPr>
-      </w:pPr>
-      <w:r>
-        <w:rPr>
-          <w:lang w:val="en-US"/>
-        </w:rPr>
-        <w:t>The system is then rebooted and ready to start the Pi-Ager. Open your browser window and enter the IP-Address of the Pi-Ager</w:t>
-      </w:r>
-      <w:r>
-        <w:rPr>
-          <w:lang w:val="en-US"/>
-        </w:rPr>
-        <w:t xml:space="preserve"> </w:t>
-      </w:r>
-      <w:r>
-        <w:rPr>
-          <w:lang w:val="en-US"/>
-        </w:rPr>
-        <w:t>in the address line</w:t>
-      </w:r>
-      <w:r>
-        <w:rPr>
-          <w:lang w:val="en-US"/>
-        </w:rPr>
-        <w:t>.</w:t>
-      </w:r>
-      <w:bookmarkStart w:id="0" w:name="_GoBack"/>
-      <w:bookmarkEnd w:id="0"/>
     </w:p>
     <w:p>
       <w:pPr>
@@ -1199,6 +841,508 @@
         <w:rPr>
           <w:lang w:val="en-US"/>
         </w:rPr>
+        <w:t xml:space="preserve">Optional download and install WinSCP from </w:t>
+      </w:r>
+      <w:hyperlink r:id="rId18" w:history="1">
+        <w:r>
+          <w:rPr>
+            <w:rStyle w:val="Hyperlink"/>
+            <w:lang w:val="en-US"/>
+          </w:rPr>
+          <w:t>https://winscp.net/eng/index.php</w:t>
+        </w:r>
+      </w:hyperlink>
+    </w:p>
+    <w:p>
+      <w:pPr>
+        <w:pStyle w:val="Listenabsatz"/>
+        <w:rPr>
+          <w:lang w:val="en-US"/>
+        </w:rPr>
+      </w:pPr>
+    </w:p>
+    <w:p>
+      <w:pPr>
+        <w:pStyle w:val="Listenabsatz"/>
+        <w:numPr>
+          <w:ilvl w:val="0"/>
+          <w:numId w:val="1"/>
+        </w:numPr>
+        <w:rPr>
+          <w:lang w:val="en-US"/>
+        </w:rPr>
+      </w:pPr>
+      <w:r>
+        <w:rPr>
+          <w:lang w:val="en-US"/>
+        </w:rPr>
+        <w:t>Start PuTTY to connect to Pi-Ager:</w:t>
+      </w:r>
+    </w:p>
+    <w:p>
+      <w:pPr>
+        <w:pStyle w:val="Listenabsatz"/>
+        <w:rPr>
+          <w:lang w:val="en-US"/>
+        </w:rPr>
+      </w:pPr>
+    </w:p>
+    <w:p>
+      <w:pPr>
+        <w:pStyle w:val="Listenabsatz"/>
+        <w:rPr>
+          <w:lang w:val="en-US"/>
+        </w:rPr>
+      </w:pPr>
+      <w:r>
+        <w:rPr>
+          <w:lang w:val="en-US"/>
+        </w:rPr>
+        <w:pict>
+          <v:shape id="_x0000_i1036" type="#_x0000_t75" style="width:339pt;height:331.5pt">
+            <v:imagedata r:id="rId19" o:title="putty1"/>
+          </v:shape>
+        </w:pict>
+      </w:r>
+    </w:p>
+    <w:p>
+      <w:pPr>
+        <w:pStyle w:val="Listenabsatz"/>
+        <w:rPr>
+          <w:lang w:val="en-US"/>
+        </w:rPr>
+      </w:pPr>
+    </w:p>
+    <w:p>
+      <w:pPr>
+        <w:pStyle w:val="Listenabsatz"/>
+        <w:rPr>
+          <w:lang w:val="en-US"/>
+        </w:rPr>
+      </w:pPr>
+      <w:r>
+        <w:rPr>
+          <w:lang w:val="en-US"/>
+        </w:rPr>
+        <w:lastRenderedPageBreak/>
+        <w:pict>
+          <v:shape id="_x0000_i1037" type="#_x0000_t75" style="width:453.75pt;height:258.75pt">
+            <v:imagedata r:id="rId20" o:title="putty2"/>
+          </v:shape>
+        </w:pict>
+      </w:r>
+    </w:p>
+    <w:p>
+      <w:pPr>
+        <w:pStyle w:val="Listenabsatz"/>
+        <w:rPr>
+          <w:lang w:val="en-US"/>
+        </w:rPr>
+      </w:pPr>
+    </w:p>
+    <w:p>
+      <w:pPr>
+        <w:pStyle w:val="Listenabsatz"/>
+        <w:numPr>
+          <w:ilvl w:val="0"/>
+          <w:numId w:val="1"/>
+        </w:numPr>
+        <w:rPr>
+          <w:lang w:val="en-US"/>
+        </w:rPr>
+      </w:pPr>
+      <w:r>
+        <w:rPr>
+          <w:lang w:val="en-US"/>
+        </w:rPr>
+        <w:t xml:space="preserve">Download </w:t>
+      </w:r>
+      <w:r>
+        <w:rPr>
+          <w:lang w:val="en-US"/>
+        </w:rPr>
+        <w:t xml:space="preserve">system build </w:t>
+      </w:r>
+      <w:r>
+        <w:rPr>
+          <w:lang w:val="en-US"/>
+        </w:rPr>
+        <w:t>scripts from github:</w:t>
+      </w:r>
+    </w:p>
+    <w:p>
+      <w:pPr>
+        <w:pStyle w:val="Listenabsatz"/>
+        <w:rPr>
+          <w:lang w:val="en-US"/>
+        </w:rPr>
+      </w:pPr>
+      <w:r>
+        <w:rPr>
+          <w:color w:val="FF0000"/>
+          <w:lang w:val="en-US"/>
+        </w:rPr>
+        <w:t>wget -O pi-ager-build-system.sh -nv</w:t>
+      </w:r>
+      <w:r>
+        <w:rPr>
+          <w:lang w:val="en-US"/>
+        </w:rPr>
+        <w:t xml:space="preserve"> </w:t>
+      </w:r>
+      <w:r>
+        <w:rPr>
+          <w:rStyle w:val="Hyperlink"/>
+          <w:lang w:val="en-US"/>
+        </w:rPr>
+        <w:t>https://github.com/Tronje-the-Falconer/Pi-Ager/raw/refs/heads/resources/anleitungen/pi-ager-build-system.sh</w:t>
+      </w:r>
+    </w:p>
+    <w:p>
+      <w:pPr>
+        <w:pStyle w:val="Listenabsatz"/>
+        <w:rPr>
+          <w:lang w:val="en-US"/>
+        </w:rPr>
+      </w:pPr>
+    </w:p>
+    <w:p>
+      <w:pPr>
+        <w:pStyle w:val="Listenabsatz"/>
+        <w:rPr>
+          <w:lang w:val="en-US"/>
+        </w:rPr>
+      </w:pPr>
+      <w:r>
+        <w:rPr>
+          <w:color w:val="FF0000"/>
+          <w:lang w:val="en-US"/>
+        </w:rPr>
+        <w:t xml:space="preserve">wget -O pi-ager-finalize-build.sh -nv </w:t>
+      </w:r>
+      <w:r>
+        <w:rPr>
+          <w:rStyle w:val="Hyperlink"/>
+          <w:lang w:val="en-US"/>
+        </w:rPr>
+        <w:t>https://github.com/Tronje-the-Falconer/Pi-Ager/raw/refs/heads/resources/anleitungen/pi-ager-finalize-build.sh</w:t>
+      </w:r>
+    </w:p>
+    <w:p>
+      <w:pPr>
+        <w:pStyle w:val="Listenabsatz"/>
+        <w:rPr>
+          <w:lang w:val="en-US"/>
+        </w:rPr>
+      </w:pPr>
+    </w:p>
+    <w:p>
+      <w:pPr>
+        <w:pStyle w:val="Listenabsatz"/>
+        <w:rPr>
+          <w:color w:val="FF0000"/>
+          <w:lang w:val="en-US"/>
+        </w:rPr>
+      </w:pPr>
+      <w:r>
+        <w:rPr>
+          <w:color w:val="FF0000"/>
+          <w:lang w:val="en-US"/>
+        </w:rPr>
+        <w:t>chmod +x *.sh</w:t>
+      </w:r>
+    </w:p>
+    <w:p>
+      <w:pPr>
+        <w:pStyle w:val="Listenabsatz"/>
+        <w:rPr>
+          <w:lang w:val="en-US"/>
+        </w:rPr>
+      </w:pPr>
+    </w:p>
+    <w:p>
+      <w:pPr>
+        <w:pStyle w:val="Listenabsatz"/>
+        <w:rPr>
+          <w:lang w:val="en-US"/>
+        </w:rPr>
+      </w:pPr>
+      <w:r>
+        <w:rPr>
+          <w:lang w:val="en-US"/>
+        </w:rPr>
+        <w:t>Start now first phase of Pi-Ager System setup:</w:t>
+      </w:r>
+    </w:p>
+    <w:p>
+      <w:pPr>
+        <w:pStyle w:val="Listenabsatz"/>
+        <w:rPr>
+          <w:color w:val="FF0000"/>
+          <w:lang w:val="en-US"/>
+        </w:rPr>
+      </w:pPr>
+      <w:r>
+        <w:rPr>
+          <w:color w:val="FF0000"/>
+          <w:lang w:val="en-US"/>
+        </w:rPr>
+        <w:t>sudo ./pi-ager-build-system.sh</w:t>
+      </w:r>
+    </w:p>
+    <w:p>
+      <w:pPr>
+        <w:pStyle w:val="Listenabsatz"/>
+        <w:rPr>
+          <w:color w:val="FF0000"/>
+          <w:lang w:val="en-US"/>
+        </w:rPr>
+      </w:pPr>
+    </w:p>
+    <w:p>
+      <w:pPr>
+        <w:pStyle w:val="Listenabsatz"/>
+        <w:rPr>
+          <w:lang w:val="en-US"/>
+        </w:rPr>
+      </w:pPr>
+      <w:r>
+        <w:rPr>
+          <w:lang w:val="en-US"/>
+        </w:rPr>
+        <w:t xml:space="preserve">You can now follow the system setup, that is divided in 4 steps with rebooting between </w:t>
+      </w:r>
+      <w:r>
+        <w:rPr>
+          <w:lang w:val="en-US"/>
+        </w:rPr>
+        <w:t>the steps</w:t>
+      </w:r>
+      <w:r>
+        <w:rPr>
+          <w:lang w:val="en-US"/>
+        </w:rPr>
+        <w:t>. Restart</w:t>
+      </w:r>
+      <w:r>
+        <w:rPr>
+          <w:lang w:val="en-US"/>
+        </w:rPr>
+        <w:t xml:space="preserve"> the script </w:t>
+      </w:r>
+      <w:r>
+        <w:rPr>
+          <w:lang w:val="en-US"/>
+        </w:rPr>
+        <w:t>after rebooting to continue the system setup</w:t>
+      </w:r>
+      <w:r>
+        <w:rPr>
+          <w:lang w:val="en-US"/>
+        </w:rPr>
+        <w:t xml:space="preserve"> :</w:t>
+      </w:r>
+    </w:p>
+    <w:p>
+      <w:pPr>
+        <w:pStyle w:val="Listenabsatz"/>
+        <w:rPr>
+          <w:lang w:val="en-US"/>
+        </w:rPr>
+      </w:pPr>
+    </w:p>
+    <w:p>
+      <w:pPr>
+        <w:pStyle w:val="Listenabsatz"/>
+        <w:rPr>
+          <w:lang w:val="en-US"/>
+        </w:rPr>
+      </w:pPr>
+      <w:r>
+        <w:rPr>
+          <w:color w:val="FF0000"/>
+          <w:lang w:val="en-US"/>
+        </w:rPr>
+        <w:t>sudo ./pi-ager-build-system.sh</w:t>
+      </w:r>
+    </w:p>
+    <w:p>
+      <w:pPr>
+        <w:pStyle w:val="Listenabsatz"/>
+        <w:rPr>
+          <w:lang w:val="en-US"/>
+        </w:rPr>
+      </w:pPr>
+    </w:p>
+    <w:p>
+      <w:pPr>
+        <w:pStyle w:val="Listenabsatz"/>
+        <w:rPr>
+          <w:lang w:val="en-US"/>
+        </w:rPr>
+      </w:pPr>
+      <w:r>
+        <w:rPr>
+          <w:lang w:val="en-US"/>
+        </w:rPr>
+        <w:t>After step 3 you should edit the file /boot/firmware/setup.txt that contains information about passwords, WLAN setup parameter, temperature/humidity sensor to use and optional HMI di</w:t>
+      </w:r>
+      <w:r>
+        <w:rPr>
+          <w:lang w:val="en-US"/>
+        </w:rPr>
+        <w:t>splay</w:t>
+      </w:r>
+      <w:r>
+        <w:rPr>
+          <w:lang w:val="en-US"/>
+        </w:rPr>
+        <w:t xml:space="preserve"> version</w:t>
+      </w:r>
+      <w:r>
+        <w:rPr>
+          <w:lang w:val="en-US"/>
+        </w:rPr>
+        <w:t xml:space="preserve"> connected to your Pi-Ager:</w:t>
+      </w:r>
+    </w:p>
+    <w:p>
+      <w:pPr>
+        <w:pStyle w:val="Listenabsatz"/>
+        <w:rPr>
+          <w:lang w:val="en-US"/>
+        </w:rPr>
+      </w:pPr>
+    </w:p>
+    <w:p>
+      <w:pPr>
+        <w:pStyle w:val="Listenabsatz"/>
+        <w:rPr>
+          <w:lang w:val="en-US"/>
+        </w:rPr>
+      </w:pPr>
+      <w:r>
+        <w:rPr>
+          <w:color w:val="FF0000"/>
+          <w:lang w:val="en-US"/>
+        </w:rPr>
+        <w:t>sudo nano /boot/firmware/setup.txt</w:t>
+      </w:r>
+    </w:p>
+    <w:p>
+      <w:pPr>
+        <w:pStyle w:val="Listenabsatz"/>
+        <w:rPr>
+          <w:lang w:val="en-US"/>
+        </w:rPr>
+      </w:pPr>
+      <w:r>
+        <w:rPr>
+          <w:lang w:val="en-US"/>
+        </w:rPr>
+        <w:lastRenderedPageBreak/>
+        <w:pict>
+          <v:shape id="_x0000_i1038" type="#_x0000_t75" style="width:453pt;height:348.75pt">
+            <v:imagedata r:id="rId21" o:title="putty3"/>
+          </v:shape>
+        </w:pict>
+      </w:r>
+    </w:p>
+    <w:p>
+      <w:pPr>
+        <w:pStyle w:val="Listenabsatz"/>
+        <w:rPr>
+          <w:lang w:val="en-US"/>
+        </w:rPr>
+      </w:pPr>
+    </w:p>
+    <w:p>
+      <w:pPr>
+        <w:pStyle w:val="Listenabsatz"/>
+        <w:rPr>
+          <w:lang w:val="en-US"/>
+        </w:rPr>
+      </w:pPr>
+      <w:r>
+        <w:rPr>
+          <w:lang w:val="en-US"/>
+        </w:rPr>
+        <w:t>After saving setup.txt the last step initializes the Pi-Ager system with data from setup.txt by starting the script pi-ager-finalize-build.sh:</w:t>
+      </w:r>
+    </w:p>
+    <w:p>
+      <w:pPr>
+        <w:pStyle w:val="Listenabsatz"/>
+        <w:rPr>
+          <w:lang w:val="en-US"/>
+        </w:rPr>
+      </w:pPr>
+    </w:p>
+    <w:p>
+      <w:pPr>
+        <w:pStyle w:val="Listenabsatz"/>
+        <w:rPr>
+          <w:color w:val="FF0000"/>
+          <w:lang w:val="en-US"/>
+        </w:rPr>
+      </w:pPr>
+      <w:r>
+        <w:rPr>
+          <w:color w:val="FF0000"/>
+          <w:lang w:val="en-US"/>
+        </w:rPr>
+        <w:t>sudo ./pi-ager-finalize-build.sh</w:t>
+      </w:r>
+    </w:p>
+    <w:p>
+      <w:pPr>
+        <w:pStyle w:val="Listenabsatz"/>
+        <w:rPr>
+          <w:lang w:val="en-US"/>
+        </w:rPr>
+      </w:pPr>
+    </w:p>
+    <w:p>
+      <w:pPr>
+        <w:pStyle w:val="Listenabsatz"/>
+        <w:rPr>
+          <w:lang w:val="en-US"/>
+        </w:rPr>
+      </w:pPr>
+      <w:r>
+        <w:rPr>
+          <w:lang w:val="en-US"/>
+        </w:rPr>
+        <w:t>The system is then rebooted and ready to start the Pi-Ager. Open your browser window and enter the IP-Address of the Pi-Ager</w:t>
+      </w:r>
+      <w:r>
+        <w:rPr>
+          <w:lang w:val="en-US"/>
+        </w:rPr>
+        <w:t xml:space="preserve"> </w:t>
+      </w:r>
+      <w:r>
+        <w:rPr>
+          <w:lang w:val="en-US"/>
+        </w:rPr>
+        <w:t>in the address line.</w:t>
+      </w:r>
+    </w:p>
+    <w:p>
+      <w:pPr>
+        <w:pStyle w:val="Listenabsatz"/>
+        <w:numPr>
+          <w:ilvl w:val="0"/>
+          <w:numId w:val="1"/>
+        </w:numPr>
+        <w:rPr>
+          <w:lang w:val="en-US"/>
+        </w:rPr>
+      </w:pPr>
+      <w:r>
+        <w:rPr>
+          <w:lang w:val="en-US"/>
+        </w:rPr>
         <w:br w:type="page"/>
       </w:r>
     </w:p>
@@ -1271,21 +1415,7 @@
         <w:rPr>
           <w:lang w:val="en-US"/>
         </w:rPr>
-        <w:t xml:space="preserve">Setup a NFS Server to store a new image. The best way is using a </w:t>
-      </w:r>
-      <w:proofErr w:type="spellStart"/>
-      <w:r>
-        <w:rPr>
-          <w:lang w:val="en-US"/>
-        </w:rPr>
-        <w:t>Raspi</w:t>
-      </w:r>
-      <w:proofErr w:type="spellEnd"/>
-      <w:r>
-        <w:rPr>
-          <w:lang w:val="en-US"/>
-        </w:rPr>
-        <w:t xml:space="preserve"> 4B or 5 equipped with an USB Memory st</w:t>
+        <w:t>Setup a NFS Server to store a new image. The best way is using a Raspi 4B or 5 equipped with an USB Memory st</w:t>
       </w:r>
       <w:r>
         <w:rPr>
@@ -1293,20 +1423,51 @@
         </w:rPr>
         <w:t xml:space="preserve">ick with 128GB or more. Using </w:t>
       </w:r>
-      <w:proofErr w:type="spellStart"/>
-      <w:r>
-        <w:rPr>
-          <w:lang w:val="en-US"/>
-        </w:rPr>
-        <w:t>RPi</w:t>
-      </w:r>
-      <w:proofErr w:type="spellEnd"/>
-      <w:r>
-        <w:rPr>
-          <w:lang w:val="en-US"/>
-        </w:rPr>
-        <w:t xml:space="preserve"> 5 it is now possible to add a NVME SSD so that there will be enough space for storing one or more images.</w:t>
-      </w:r>
+      <w:r>
+        <w:rPr>
+          <w:lang w:val="en-US"/>
+        </w:rPr>
+        <w:t>RPi 5 it is now possible to add a NVME SSD so that there will be enough space for storing one or more images.</w:t>
+      </w:r>
+    </w:p>
+    <w:p>
+      <w:pPr>
+        <w:pStyle w:val="Listenabsatz"/>
+        <w:rPr>
+          <w:lang w:val="en-US"/>
+        </w:rPr>
+      </w:pPr>
+      <w:r>
+        <w:rPr>
+          <w:lang w:val="en-US"/>
+        </w:rPr>
+        <w:t xml:space="preserve">How to setup a NFS Server </w:t>
+      </w:r>
+      <w:r>
+        <w:rPr>
+          <w:lang w:val="en-US"/>
+        </w:rPr>
+        <w:t>:</w:t>
+      </w:r>
+      <w:bookmarkStart w:id="0" w:name="_GoBack"/>
+      <w:bookmarkEnd w:id="0"/>
+    </w:p>
+    <w:p>
+      <w:pPr>
+        <w:pStyle w:val="Listenabsatz"/>
+        <w:rPr>
+          <w:lang w:val="en-US"/>
+        </w:rPr>
+      </w:pPr>
+      <w:hyperlink r:id="rId22" w:history="1">
+        <w:r>
+          <w:rPr>
+            <w:rStyle w:val="Hyperlink"/>
+            <w:lang w:val="en-US"/>
+          </w:rPr>
+          <w:t>https://www.elektronik-kompendium.de/sites/raspberry-pi/2007061.htm</w:t>
+        </w:r>
+      </w:hyperlink>
     </w:p>
     <w:p>
       <w:pPr>
@@ -1323,44 +1484,16 @@
         <w:rPr>
           <w:lang w:val="en-US"/>
         </w:rPr>
-        <w:t xml:space="preserve">On the NFS Server System </w:t>
-      </w:r>
-      <w:r>
-        <w:rPr>
-          <w:lang w:val="en-US"/>
-        </w:rPr>
-        <w:t>Instal</w:t>
-      </w:r>
-      <w:r>
-        <w:rPr>
-          <w:lang w:val="en-US"/>
-        </w:rPr>
-        <w:t>l Pi Power Tools using the well-</w:t>
-      </w:r>
-      <w:r>
-        <w:rPr>
-          <w:lang w:val="en-US"/>
-        </w:rPr>
-        <w:t>known Pi-Apps.</w:t>
-      </w:r>
-    </w:p>
-    <w:p>
-      <w:pPr>
-        <w:pStyle w:val="Listenabsatz"/>
-        <w:numPr>
-          <w:ilvl w:val="0"/>
-          <w:numId w:val="11"/>
-        </w:numPr>
-        <w:rPr>
-          <w:lang w:val="en-US"/>
-        </w:rPr>
-      </w:pPr>
-      <w:r>
-        <w:rPr>
-          <w:lang w:val="en-US"/>
-        </w:rPr>
         <w:t>On the Pi-Ager setup and start an Image backup on the ADMIN page. For example :</w:t>
       </w:r>
+    </w:p>
+    <w:p>
+      <w:pPr>
+        <w:pStyle w:val="Listenabsatz"/>
+        <w:rPr>
+          <w:lang w:val="en-US"/>
+        </w:rPr>
+      </w:pPr>
     </w:p>
     <w:p>
       <w:pPr>
@@ -1390,7 +1523,7 @@
                     <pic:cNvPicPr/>
                   </pic:nvPicPr>
                   <pic:blipFill>
-                    <a:blip r:embed="rId18"/>
+                    <a:blip r:embed="rId23"/>
                     <a:stretch>
                       <a:fillRect/>
                     </a:stretch>
@@ -1460,6 +1593,12 @@
         </w:rPr>
         <w:t>:</w:t>
       </w:r>
+      <w:r>
+        <w:rPr>
+          <w:lang w:val="en-US"/>
+        </w:rPr>
+        <w:t xml:space="preserve"> (lowercase ‘L’)</w:t>
+      </w:r>
     </w:p>
     <w:p>
       <w:pPr>
@@ -1490,7 +1629,7 @@
                     <pic:cNvPicPr/>
                   </pic:nvPicPr>
                   <pic:blipFill>
-                    <a:blip r:embed="rId19"/>
+                    <a:blip r:embed="rId24"/>
                     <a:stretch>
                       <a:fillRect/>
                     </a:stretch>
@@ -1658,7 +1797,7 @@
   <w:abstractNum w:abstractNumId="1" w15:restartNumberingAfterBreak="0">
     <w:nsid w:val="17A70F0D"/>
     <w:multiLevelType w:val="hybridMultilevel"/>
-    <w:tmpl w:val="4288E9BA"/>
+    <w:tmpl w:val="61E628C8"/>
     <w:lvl w:ilvl="0" w:tplc="04070001">
       <w:start w:val="1"/>
       <w:numFmt w:val="bullet"/>

</xml_diff>